<commit_message>
add second line change2
</commit_message>
<xml_diff>
--- a/file1.docx
+++ b/file1.docx
@@ -13,6 +13,19 @@
           <w:lang w:val="en-US"/>
         </w:rPr>
         <w:t>Change1</w:t>
+      </w:r>
+    </w:p>
+    <w:p>
+      <w:pPr>
+        <w:rPr>
+          <w:lang w:val="en-US"/>
+        </w:rPr>
+      </w:pPr>
+      <w:r>
+        <w:rPr>
+          <w:lang w:val="en-US"/>
+        </w:rPr>
+        <w:t>Change2</w:t>
       </w:r>
       <w:bookmarkStart w:id="0" w:name="_GoBack"/>
       <w:bookmarkEnd w:id="0"/>

</xml_diff>

<commit_message>
add third line change3
</commit_message>
<xml_diff>
--- a/file1.docx
+++ b/file1.docx
@@ -26,6 +26,19 @@
           <w:lang w:val="en-US"/>
         </w:rPr>
         <w:t>Change2</w:t>
+      </w:r>
+    </w:p>
+    <w:p>
+      <w:pPr>
+        <w:rPr>
+          <w:lang w:val="en-US"/>
+        </w:rPr>
+      </w:pPr>
+      <w:r>
+        <w:rPr>
+          <w:lang w:val="en-US"/>
+        </w:rPr>
+        <w:t>Change3</w:t>
       </w:r>
       <w:bookmarkStart w:id="0" w:name="_GoBack"/>
       <w:bookmarkEnd w:id="0"/>

</xml_diff>

<commit_message>
file1 changed by user1
</commit_message>
<xml_diff>
--- a/file1.docx
+++ b/file1.docx
@@ -72,6 +72,26 @@
           <w:lang w:val="en-US"/>
         </w:rPr>
         <w:t>Good by</w:t>
+      </w:r>
+    </w:p>
+    <w:p>
+      <w:pPr>
+        <w:rPr>
+          <w:lang w:val="en-US"/>
+        </w:rPr>
+      </w:pPr>
+    </w:p>
+    <w:p>
+      <w:pPr>
+        <w:rPr>
+          <w:lang w:val="en-US"/>
+        </w:rPr>
+      </w:pPr>
+      <w:r>
+        <w:rPr>
+          <w:lang w:val="en-US"/>
+        </w:rPr>
+        <w:t>Line from user1</w:t>
       </w:r>
       <w:bookmarkStart w:id="0" w:name="_GoBack"/>
       <w:bookmarkEnd w:id="0"/>

</xml_diff>

<commit_message>
file1 changed by user2
</commit_message>
<xml_diff>
--- a/file1.docx
+++ b/file1.docx
@@ -40,6 +40,8 @@
         </w:rPr>
         <w:t>Change3</w:t>
       </w:r>
+      <w:bookmarkStart w:id="0" w:name="_GoBack"/>
+      <w:bookmarkEnd w:id="0"/>
     </w:p>
     <w:p>
       <w:pPr>
@@ -93,8 +95,19 @@
         </w:rPr>
         <w:t>Line from user1</w:t>
       </w:r>
-      <w:bookmarkStart w:id="0" w:name="_GoBack"/>
-      <w:bookmarkEnd w:id="0"/>
+    </w:p>
+    <w:p>
+      <w:pPr>
+        <w:rPr>
+          <w:lang w:val="en-US"/>
+        </w:rPr>
+      </w:pPr>
+      <w:r>
+        <w:rPr>
+          <w:lang w:val="en-US"/>
+        </w:rPr>
+        <w:t>Line from user2</w:t>
+      </w:r>
     </w:p>
     <w:p>
       <w:pPr>

</xml_diff>